<commit_message>
Megvalósíthatósági tanulmányok frissítése ÉTLAP-os probléma kapcsán
</commit_message>
<xml_diff>
--- a/megvalosithatosagi_tanulmanyok/Megvalosithatosagi_Tanulmany_Kliens.docx
+++ b/megvalosithatosagi_tanulmanyok/Megvalosithatosagi_Tanulmany_Kliens.docx
@@ -1222,7 +1222,7 @@
         <w:rPr>
           <w:rFonts w:ascii="Arial" w:hAnsi="Arial" w:cs="Arial"/>
         </w:rPr>
-        <w:t>A recept fő adatai első körben a Hotcakes kategória meglévő mezőiben tarthatók: név, leírás, alap szöveges tartalom és a publikáláshoz szükséges besorolás. A cél az, hogy a POC ne építsen külön recepttáblát, ha ez nem muszáj.</w:t>
+        <w:t>A recept fő adatai első körben a Hotcakes kategória meglévő mezőiben tarthatók: név, leírás, alap szöveges tartalom és a publikáláshoz szükséges besorolás. A recept kategória Hotcakes oldalon alapértelmezetten rejtett (Hidden = true), hogy ne jelenjen meg az ÉTLAP kategórialistában; a vásárlói recept modul a metadata Status = Published értéke alapján jeleníti meg. A cél az, hogy a POC ne építsen külön recepttáblát, ha ez nem muszáj.</w:t>
       </w:r>
     </w:p>
     <w:p>
@@ -1487,7 +1487,7 @@
         <w:rPr>
           <w:rFonts w:ascii="Arial" w:hAnsi="Arial" w:cs="Arial"/>
         </w:rPr>
-        <w:t>Az adattárolás elsődlegesen a meglévő DNN és Hotcakes szerkezetre épül. A legfontosabb műveletek a termékek és kategóriák lekérése, a receptet reprezentáló kategória mentése vagy frissítése, valamint a termék-hozzárendelések kezelése.</w:t>
+        <w:t>Az adattárolás elsődlegesen a meglévő DNN és Hotcakes szerkezetre épül. A legfontosabb műveletek a termékek és kategóriák lekérése, a receptet reprezentáló rejtett kategória mentése vagy frissítése, a metadata státusz kezelése, valamint a termék-hozzárendelések kezelése.</w:t>
       </w:r>
     </w:p>
     <w:p>

</xml_diff>